<commit_message>
Add value_label_test and accept item numbers in label_test
value_label_test() compares the value labels in the data with the codes
of the we-tags in the PV: codes with conditions, buttons, multiple choice
codes, season codes for month variables, fill-ins and lists like
[Laenderliste]. pv_value_labels() returns the expected codes.

label_test() now accepts labels that refer to other items by item number
where the PV uses the variable name, if the number belongs to that
variable.

New vignette label_test explains how both tests work.
</commit_message>
<xml_diff>
--- a/tests/testthat/fixtures/pv_test.docx
+++ b/tests/testthat/fixtures/pv_test.docx
@@ -524,6 +524,19 @@
             </w:r>
           </w:p>
           <w:p>
+            <w:r/>
+          </w:p>
+          <w:p>
+            <w:r>
+              <w:t>[0: nicht genannt]</w:t>
+            </w:r>
+          </w:p>
+          <w:p>
+            <w:r>
+              <w:t>[1: genannt]</w:t>
+            </w:r>
+          </w:p>
+          <w:p>
             <w:r>
               <w:t>--end--</w:t>
             </w:r>
@@ -595,6 +608,387 @@
           <w:p>
             <w:r>
               <w:t>--fr: Frage</w:t>
+            </w:r>
+          </w:p>
+          <w:p>
+            <w:r>
+              <w:t>--end--</w:t>
+            </w:r>
+          </w:p>
+        </w:tc>
+      </w:tr>
+      <w:tr>
+        <w:tc>
+          <w:tcPr>
+            <w:tcW w:type="dxa" w:w="4320"/>
+          </w:tcPr>
+          <w:p>
+            <w:r>
+              <w:t>26110</w:t>
+            </w:r>
+          </w:p>
+        </w:tc>
+        <w:tc>
+          <w:tcPr>
+            <w:tcW w:type="dxa" w:w="4320"/>
+          </w:tcPr>
+          <w:p>
+            <w:r>
+              <w:t>--va: etnr</w:t>
+            </w:r>
+          </w:p>
+          <w:p>
+            <w:r>
+              <w:t>--vb: ET-Episodennummer</w:t>
+            </w:r>
+          </w:p>
+          <w:p>
+            <w:r>
+              <w:t>--fr: [AUTO] Episodennummer</w:t>
+            </w:r>
+          </w:p>
+          <w:p>
+            <w:r>
+              <w:t>--end--</w:t>
+            </w:r>
+          </w:p>
+        </w:tc>
+      </w:tr>
+      <w:tr>
+        <w:tc>
+          <w:tcPr>
+            <w:tcW w:type="dxa" w:w="4320"/>
+          </w:tcPr>
+          <w:p>
+            <w:r>
+              <w:t>26103P3</w:t>
+            </w:r>
+          </w:p>
+        </w:tc>
+        <w:tc>
+          <w:tcPr>
+            <w:tcW w:type="dxa" w:w="4320"/>
+          </w:tcPr>
+          <w:p>
+            <w:r>
+              <w:t>--va: etnrPRE</w:t>
+            </w:r>
+          </w:p>
+          <w:p>
+            <w:r>
+              <w:t>--vb: Preload ET-Episodennummer dieser Episode (etnr)</w:t>
+            </w:r>
+          </w:p>
+          <w:p>
+            <w:r>
+              <w:t>--fr: [AUTO]</w:t>
+            </w:r>
+          </w:p>
+          <w:p>
+            <w:r>
+              <w:t>--end--</w:t>
+            </w:r>
+          </w:p>
+        </w:tc>
+      </w:tr>
+      <w:tr>
+        <w:tc>
+          <w:tcPr>
+            <w:tcW w:type="dxa" w:w="4320"/>
+          </w:tcPr>
+          <w:p>
+            <w:r>
+              <w:t>26103P6</w:t>
+            </w:r>
+          </w:p>
+        </w:tc>
+        <w:tc>
+          <w:tcPr>
+            <w:tcW w:type="dxa" w:w="4320"/>
+          </w:tcPr>
+          <w:p>
+            <w:r>
+              <w:t>--va: etstdatPRE (etstmPRE / etstjPRE)</w:t>
+            </w:r>
+          </w:p>
+          <w:p>
+            <w:r>
+              <w:t>--vb: Preload Startdatum (-monat/-jahr) ET-Episode (etstdat (etstm / etstj))</w:t>
+            </w:r>
+          </w:p>
+          <w:p>
+            <w:r>
+              <w:t>--fr: [AUTO]</w:t>
+            </w:r>
+          </w:p>
+          <w:p>
+            <w:r>
+              <w:t>--end--</w:t>
+            </w:r>
+          </w:p>
+        </w:tc>
+      </w:tr>
+      <w:tr>
+        <w:tc>
+          <w:tcPr>
+            <w:tcW w:type="dxa" w:w="4320"/>
+          </w:tcPr>
+          <w:p>
+            <w:r>
+              <w:t>26111</w:t>
+            </w:r>
+          </w:p>
+        </w:tc>
+        <w:tc>
+          <w:tcPr>
+            <w:tcW w:type="dxa" w:w="4320"/>
+          </w:tcPr>
+          <w:p>
+            <w:r>
+              <w:t>--va: etbs</w:t>
+            </w:r>
+          </w:p>
+          <w:p>
+            <w:r>
+              <w:t>--vb: Berufliche Stellung</w:t>
+            </w:r>
+          </w:p>
+          <w:p>
+            <w:r>
+              <w:t>--fr: Frage</w:t>
+            </w:r>
+          </w:p>
+          <w:p/>
+          <w:p>
+            <w:r>
+              <w:t>--we:</w:t>
+            </w:r>
+          </w:p>
+          <w:p>
+            <w:r>
+              <w:t>1: Arbeiter/in</w:t>
+            </w:r>
+          </w:p>
+          <w:p>
+            <w:r>
+              <w:t>2: Angestellte/r</w:t>
+            </w:r>
+          </w:p>
+          <w:p>
+            <w:r>
+              <w:t>if (h_etauto = 0) 5: Selbstständige/r</w:t>
+            </w:r>
+          </w:p>
+          <w:p>
+            <w:r>
+              <w:t>if ((etbsPRE = 1 to 4) &amp; etzeitPRE &lt;&gt; 1) 7: Freie/r Mitarbeiter/in</w:t>
+            </w:r>
+          </w:p>
+          <w:p>
+            <w:r>
+              <w:t>&lt;&lt;z. B. Honorarkraft&gt;&gt;</w:t>
+            </w:r>
+          </w:p>
+          <w:p>
+            <w:r>
+              <w:tab/>
+              <w:t>BUTTONS: verweigert (-97), weiß nicht (-98), [if etbs = 5] keine Beschäftigten (0)</w:t>
+            </w:r>
+          </w:p>
+          <w:p>
+            <w:r>
+              <w:t>--end--</w:t>
+            </w:r>
+          </w:p>
+        </w:tc>
+      </w:tr>
+      <w:tr>
+        <w:tc>
+          <w:tcPr>
+            <w:tcW w:type="dxa" w:w="4320"/>
+          </w:tcPr>
+          <w:p>
+            <w:r>
+              <w:t>26124</w:t>
+            </w:r>
+          </w:p>
+        </w:tc>
+        <w:tc>
+          <w:tcPr>
+            <w:tcW w:type="dxa" w:w="4320"/>
+          </w:tcPr>
+          <w:p>
+            <w:r>
+              <w:t>--va: etenddat (etendm / etendj)</w:t>
+            </w:r>
+          </w:p>
+          <w:p>
+            <w:r>
+              <w:t>--vb: Enddatum (-monat/-jahr) Erwerbsepisode</w:t>
+            </w:r>
+          </w:p>
+          <w:p>
+            <w:r>
+              <w:t>--fr: Bis wann?</w:t>
+            </w:r>
+          </w:p>
+          <w:p/>
+          <w:p>
+            <w:r>
+              <w:t xml:space="preserve">--in: </w:t>
+            </w:r>
+          </w:p>
+          <w:p>
+            <w:r>
+              <w:t>Erinnert sich die Zielperson nur an Jahreszeiten, bitte folgende Nummern eingeben: 21=Jahresanfang/Winter</w:t>
+            </w:r>
+          </w:p>
+          <w:p>
+            <w:r>
+              <w:t>24=Frühjahr/Ostern</w:t>
+            </w:r>
+          </w:p>
+          <w:p>
+            <w:r>
+              <w:t>27=Jahresmitte/Sommer</w:t>
+            </w:r>
+          </w:p>
+          <w:p>
+            <w:r>
+              <w:t>30=Herbst</w:t>
+            </w:r>
+          </w:p>
+          <w:p>
+            <w:r>
+              <w:t>32=Jahresende</w:t>
+            </w:r>
+          </w:p>
+          <w:p/>
+          <w:p>
+            <w:r>
+              <w:t>--we:</w:t>
+            </w:r>
+          </w:p>
+          <w:p>
+            <w:r>
+              <w:t>bis Monat ____ Jahr _____</w:t>
+            </w:r>
+          </w:p>
+          <w:p>
+            <w:r>
+              <w:t>BUTTONS: verweigert (-97), weiß nicht (-98), [if h_panel = 0] bis heute (-5)</w:t>
+            </w:r>
+          </w:p>
+          <w:p>
+            <w:r>
+              <w:t>--end--</w:t>
+            </w:r>
+          </w:p>
+        </w:tc>
+      </w:tr>
+      <w:tr>
+        <w:tc>
+          <w:tcPr>
+            <w:tcW w:type="dxa" w:w="4320"/>
+          </w:tcPr>
+          <w:p>
+            <w:r>
+              <w:t>26400</w:t>
+            </w:r>
+          </w:p>
+        </w:tc>
+        <w:tc>
+          <w:tcPr>
+            <w:tcW w:type="dxa" w:w="4320"/>
+          </w:tcPr>
+          <w:p>
+            <w:r>
+              <w:t>--va: tasketnr</w:t>
+            </w:r>
+          </w:p>
+          <w:p>
+            <w:r>
+              <w:t>--vb: Auswahl Erwerbsepisode</w:t>
+            </w:r>
+          </w:p>
+          <w:p>
+            <w:r>
+              <w:t>--fr: Welche Tätigkeit?</w:t>
+            </w:r>
+          </w:p>
+          <w:p/>
+          <w:p>
+            <w:r>
+              <w:t>--we:</w:t>
+            </w:r>
+          </w:p>
+          <w:p>
+            <w:r>
+              <w:t>1: &lt;h_etarta1&gt;</w:t>
+            </w:r>
+          </w:p>
+          <w:p>
+            <w:r>
+              <w:t>if (h_etiz &gt;= 2) 2: &lt;h_etarta2&gt;</w:t>
+            </w:r>
+          </w:p>
+          <w:p>
+            <w:r>
+              <w:t>--end--</w:t>
+            </w:r>
+          </w:p>
+        </w:tc>
+      </w:tr>
+      <w:tr>
+        <w:tc>
+          <w:tcPr>
+            <w:tcW w:type="dxa" w:w="4320"/>
+          </w:tcPr>
+          <w:p>
+            <w:r>
+              <w:t>26164</w:t>
+            </w:r>
+          </w:p>
+        </w:tc>
+        <w:tc>
+          <w:tcPr>
+            <w:tcW w:type="dxa" w:w="4320"/>
+          </w:tcPr>
+          <w:p>
+            <w:r>
+              <w:t>--va: etland</w:t>
+            </w:r>
+          </w:p>
+          <w:p>
+            <w:r>
+              <w:t>--vb: Land der Arbeitsstätte</w:t>
+            </w:r>
+          </w:p>
+          <w:p>
+            <w:r>
+              <w:t>--fr: In welchem Land ist das?</w:t>
+            </w:r>
+          </w:p>
+          <w:p/>
+          <w:p>
+            <w:r>
+              <w:t>--in: Bitte Ländernamen aus Liste auswählen.</w:t>
+            </w:r>
+          </w:p>
+          <w:p/>
+          <w:p>
+            <w:r>
+              <w:t>--we:</w:t>
+            </w:r>
+          </w:p>
+          <w:p>
+            <w:r>
+              <w:t>[Länderliste]</w:t>
+            </w:r>
+          </w:p>
+          <w:p>
+            <w:r>
+              <w:t>BUTTONS: verweigert (-97), weiß nicht (-98), Land nicht in Liste (-96)</w:t>
             </w:r>
           </w:p>
           <w:p>

</xml_diff>